<commit_message>
README: add badge row and GitHub repo link
Python version, FastAPI, tests, prototype-status, and repo badges at
the top. Deliberately no license or CI-passing badge: there's no
LICENSE file yet, and no workflow currently runs pytest, so either
would assert something unverified.

Also updates the GitHub repo's About description and topics.

Co-Authored-By: Claude Opus 5 <noreply@anthropic.com>
</commit_message>
<xml_diff>
--- a/Medical-Miscommunication-Detector.docx
+++ b/Medical-Miscommunication-Detector.docx
@@ -16,6 +16,67 @@
           <w:sz w:val="52"/>
         </w:rPr>
         <w:t>Medical Miscommunication Detector</w:t>
+      </w:r>
+    </w:p>
+    <w:p>
+      <w:r>
+        <w:rPr>
+          <w:rFonts w:ascii="Calibri" w:hAnsi="Calibri" w:eastAsia="Calibri"/>
+          <w:color w:val="0F6E6E"/>
+        </w:rPr>
+        <w:t>Python 3.11+</w:t>
+      </w:r>
+      <w:r>
+        <w:rPr>
+          <w:rFonts w:ascii="Calibri" w:hAnsi="Calibri" w:eastAsia="Calibri"/>
+        </w:rPr>
+        <w:t xml:space="preserve"> </w:t>
+      </w:r>
+      <w:r>
+        <w:rPr>
+          <w:rFonts w:ascii="Calibri" w:hAnsi="Calibri" w:eastAsia="Calibri"/>
+          <w:color w:val="0F6E6E"/>
+        </w:rPr>
+        <w:t>FastAPI</w:t>
+      </w:r>
+      <w:r>
+        <w:rPr>
+          <w:rFonts w:ascii="Calibri" w:hAnsi="Calibri" w:eastAsia="Calibri"/>
+        </w:rPr>
+        <w:t xml:space="preserve"> </w:t>
+      </w:r>
+      <w:r>
+        <w:rPr>
+          <w:rFonts w:ascii="Calibri" w:hAnsi="Calibri" w:eastAsia="Calibri"/>
+          <w:color w:val="0F6E6E"/>
+        </w:rPr>
+        <w:t>Tests: pytest</w:t>
+      </w:r>
+      <w:r>
+        <w:rPr>
+          <w:rFonts w:ascii="Calibri" w:hAnsi="Calibri" w:eastAsia="Calibri"/>
+        </w:rPr>
+        <w:t xml:space="preserve"> </w:t>
+      </w:r>
+      <w:r>
+        <w:rPr>
+          <w:rFonts w:ascii="Calibri" w:hAnsi="Calibri" w:eastAsia="Calibri"/>
+          <w:color w:val="0F6E6E"/>
+        </w:rPr>
+        <w:t>Status: prototype</w:t>
+      </w:r>
+      <w:r>
+        <w:rPr>
+          <w:rFonts w:ascii="Calibri" w:hAnsi="Calibri" w:eastAsia="Calibri"/>
+        </w:rPr>
+        <w:t xml:space="preserve"> </w:t>
+      </w:r>
+      <w:r>
+        <w:rPr>
+          <w:rFonts w:ascii="Calibri" w:hAnsi="Calibri" w:eastAsia="Calibri"/>
+          <w:color w:val="0F6E6E"/>
+        </w:rPr>
+        <w:t>Repo</w:t>
       </w:r>
     </w:p>
     <w:p>

</xml_diff>